<commit_message>
Reports: Implemented high-fidelity Cover Page, TOC, and Executive Summary boxes.
</commit_message>
<xml_diff>
--- a/Backend/report_templates/marketing_report.docx
+++ b/Backend/report_templates/marketing_report.docx
@@ -2,6 +2,65 @@
 <file path=word/document.xml><?xml version="1.0" encoding="utf-8"?>
 <w:document xmlns:wpc="http://schemas.microsoft.com/office/word/2010/wordprocessingCanvas" xmlns:mo="http://schemas.microsoft.com/office/mac/office/2008/main" xmlns:mc="http://schemas.openxmlformats.org/markup-compatibility/2006" xmlns:mv="urn:schemas-microsoft-com:mac:vml" xmlns:o="urn:schemas-microsoft-com:office:office" xmlns:r="http://schemas.openxmlformats.org/officeDocument/2006/relationships" xmlns:m="http://schemas.openxmlformats.org/officeDocument/2006/math" xmlns:v="urn:schemas-microsoft-com:vml" xmlns:wp14="http://schemas.microsoft.com/office/word/2010/wordprocessingDrawing" xmlns:wp="http://schemas.openxmlformats.org/drawingml/2006/wordprocessingDrawing" xmlns:w10="urn:schemas-microsoft-com:office:word" xmlns:w="http://schemas.openxmlformats.org/wordprocessingml/2006/main" xmlns:w14="http://schemas.microsoft.com/office/word/2010/wordml" xmlns:wpg="http://schemas.microsoft.com/office/word/2010/wordprocessingGroup" xmlns:wpi="http://schemas.microsoft.com/office/word/2010/wordprocessingInk" xmlns:wne="http://schemas.microsoft.com/office/word/2006/wordml" xmlns:wps="http://schemas.microsoft.com/office/word/2010/wordprocessingShape" mc:Ignorable="w14 wp14">
   <w:body>
+    <w:p>
+      <w:pPr>
+        <w:jc w:val="center"/>
+      </w:pPr>
+      <w:r>
+        <w:drawing>
+          <wp:inline xmlns:a="http://schemas.openxmlformats.org/drawingml/2006/main" xmlns:pic="http://schemas.openxmlformats.org/drawingml/2006/picture">
+            <wp:extent cx="2743200" cy="1038118"/>
+            <wp:docPr id="1" name="Picture 1"/>
+            <wp:cNvGraphicFramePr>
+              <a:graphicFrameLocks noChangeAspect="1"/>
+            </wp:cNvGraphicFramePr>
+            <a:graphic>
+              <a:graphicData uri="http://schemas.openxmlformats.org/drawingml/2006/picture">
+                <pic:pic>
+                  <pic:nvPicPr>
+                    <pic:cNvPr id="0" name="adept_logo.jpg"/>
+                    <pic:cNvPicPr/>
+                  </pic:nvPicPr>
+                  <pic:blipFill>
+                    <a:blip r:embed="rId9"/>
+                    <a:stretch>
+                      <a:fillRect/>
+                    </a:stretch>
+                  </pic:blipFill>
+                  <pic:spPr>
+                    <a:xfrm>
+                      <a:off x="0" y="0"/>
+                      <a:ext cx="2743200" cy="1038118"/>
+                    </a:xfrm>
+                    <a:prstGeom prst="rect"/>
+                  </pic:spPr>
+                </pic:pic>
+              </a:graphicData>
+            </a:graphic>
+          </wp:inline>
+        </w:drawing>
+      </w:r>
+    </w:p>
+    <w:p>
+      <w:r>
+        <w:br/>
+        <w:br/>
+        <w:br/>
+      </w:r>
+    </w:p>
+    <w:p>
+      <w:pPr>
+        <w:jc w:val="center"/>
+      </w:pPr>
+      <w:r>
+        <w:rPr>
+          <w:b/>
+          <w:color w:val="1D4E89"/>
+          <w:sz w:val="72"/>
+        </w:rPr>
+        <w:t>MARKETING PERFORMANCE REPORT</w:t>
+      </w:r>
+    </w:p>
     <w:p>
       <w:r>
         <w:br/>
@@ -9,94 +68,61 @@
     </w:p>
     <w:p>
       <w:pPr>
-        <w:jc w:val="left"/>
+        <w:jc w:val="center"/>
+      </w:pPr>
+      <w:r>
+        <w:rPr>
+          <w:color w:val="666666"/>
+          <w:sz w:val="28"/>
+        </w:rPr>
+        <w:t>{{ currentDate }}</w:t>
+      </w:r>
+    </w:p>
+    <w:p>
+      <w:r>
+        <w:br w:type="page"/>
+      </w:r>
+    </w:p>
+    <w:p>
+      <w:pPr>
+        <w:pStyle w:val="Heading1"/>
+      </w:pPr>
+      <w:r>
+        <w:rPr>
+          <w:color w:val="1D4E89"/>
+        </w:rPr>
+        <w:t>TABLE OF CONTENTS</w:t>
+      </w:r>
+    </w:p>
+    <w:p>
+      <w:r>
+        <w:t>Table of Contents will be generated here. (Right-click and select 'Update Field' in Word)</w:t>
+      </w:r>
+    </w:p>
+    <w:p>
+      <w:r>
+        <w:br w:type="page"/>
+      </w:r>
+    </w:p>
+    <w:p>
+      <w:pPr>
+        <w:jc w:val="right"/>
       </w:pPr>
       <w:r>
         <w:rPr>
           <w:b/>
           <w:color w:val="1D4E89"/>
-          <w:sz w:val="52"/>
+          <w:sz w:val="36"/>
+          <w:u w:val="single"/>
         </w:rPr>
         <w:t>Marketing Performance Report</w:t>
       </w:r>
     </w:p>
-    <w:tbl>
-      <w:tblPr>
-        <w:tblStyle w:val="TableGrid"/>
-        <w:tblW w:type="auto" w:w="0"/>
-        <w:tblLook w:firstColumn="1" w:firstRow="1" w:lastColumn="0" w:lastRow="0" w:noHBand="0" w:noVBand="1" w:val="04A0"/>
-      </w:tblPr>
-      <w:tblGrid>
-        <w:gridCol w:w="4320"/>
-        <w:gridCol w:w="4320"/>
-      </w:tblGrid>
-      <w:tr>
-        <w:tc>
-          <w:tcPr>
-            <w:tcW w:type="dxa" w:w="4320"/>
-          </w:tcPr>
-          <w:p>
-            <w:r>
-              <w:t>Report Type:</w:t>
-            </w:r>
-          </w:p>
-        </w:tc>
-        <w:tc>
-          <w:tcPr>
-            <w:tcW w:type="dxa" w:w="4320"/>
-          </w:tcPr>
-          <w:p>
-            <w:r>
-              <w:t>Marketing Performance Report</w:t>
-            </w:r>
-          </w:p>
-        </w:tc>
-      </w:tr>
-      <w:tr>
-        <w:tc>
-          <w:tcPr>
-            <w:tcW w:type="dxa" w:w="4320"/>
-          </w:tcPr>
-          <w:p>
-            <w:r>
-              <w:t>Project/Campaign:</w:t>
-            </w:r>
-          </w:p>
-        </w:tc>
-        <w:tc>
-          <w:tcPr>
-            <w:tcW w:type="dxa" w:w="4320"/>
-          </w:tcPr>
-          <w:p>
-            <w:r>
-              <w:t>{{ project_name if project_name else campaign_name }}</w:t>
-            </w:r>
-          </w:p>
-        </w:tc>
-      </w:tr>
-      <w:tr>
-        <w:tc>
-          <w:tcPr>
-            <w:tcW w:type="dxa" w:w="4320"/>
-          </w:tcPr>
-          <w:p>
-            <w:r>
-              <w:t>Date:</w:t>
-            </w:r>
-          </w:p>
-        </w:tc>
-        <w:tc>
-          <w:tcPr>
-            <w:tcW w:type="dxa" w:w="4320"/>
-          </w:tcPr>
-          <w:p>
-            <w:r>
-              <w:t>{{ date if date else currentDate }}</w:t>
-            </w:r>
-          </w:p>
-        </w:tc>
-      </w:tr>
-    </w:tbl>
+    <w:p>
+      <w:r>
+        <w:br/>
+      </w:r>
+    </w:p>
     <w:p>
       <w:r>
         <w:br/>
@@ -105,6 +131,11 @@
     <w:p>
       <w:r>
         <w:t>{% for id, section in sections.items() %}</w:t>
+      </w:r>
+    </w:p>
+    <w:p>
+      <w:r>
+        <w:t>{% if id != 'metadata' %}</w:t>
       </w:r>
     </w:p>
     <w:p>
@@ -120,7 +151,7 @@
     </w:p>
     <w:p>
       <w:r>
-        <w:t>{{ section.aiDraft }}</w:t>
+        <w:t>{{ section.aiDraft if section.aiDraft else section.userOverride }}</w:t>
       </w:r>
     </w:p>
     <w:p>
@@ -130,14 +161,18 @@
     </w:p>
     <w:p>
       <w:r>
+        <w:t>{% endif %}</w:t>
+      </w:r>
+    </w:p>
+    <w:p>
+      <w:r>
         <w:t>{% endfor %}</w:t>
       </w:r>
     </w:p>
     <w:sectPr>
-      <w:headerReference w:type="default" r:id="rId9"/>
       <w:footerReference w:type="default" r:id="rId10"/>
       <w:pgSz w:w="12240" w:h="15840"/>
-      <w:pgMar w:top="1080" w:right="1440" w:bottom="1440" w:left="2160" w:header="720" w:footer="720" w:gutter="0"/>
+      <w:pgMar w:top="1440" w:right="1440" w:bottom="1440" w:left="2160" w:header="720" w:footer="720" w:gutter="0"/>
       <w:cols w:space="720"/>
       <w:docGrid w:linePitch="360"/>
     </w:sectPr>
@@ -155,7 +190,7 @@
     <w:r>
       <w:drawing>
         <wp:inline xmlns:a="http://schemas.openxmlformats.org/drawingml/2006/main" xmlns:pic="http://schemas.openxmlformats.org/drawingml/2006/picture">
-          <wp:extent cx="5486400" cy="1029407"/>
+          <wp:extent cx="5943600" cy="1115191"/>
           <wp:docPr id="1" name="Picture 1"/>
           <wp:cNvGraphicFramePr>
             <a:graphicFrameLocks noChangeAspect="1"/>
@@ -176,7 +211,7 @@
                 <pic:spPr>
                   <a:xfrm>
                     <a:off x="0" y="0"/>
-                    <a:ext cx="5486400" cy="1029407"/>
+                    <a:ext cx="5943600" cy="1115191"/>
                   </a:xfrm>
                   <a:prstGeom prst="rect"/>
                 </pic:spPr>
@@ -188,51 +223,6 @@
     </w:r>
   </w:p>
 </w:ftr>
-</file>
-
-<file path=word/header1.xml><?xml version="1.0" encoding="utf-8"?>
-<w:hdr xmlns:m="http://schemas.openxmlformats.org/officeDocument/2006/math" xmlns:mc="http://schemas.openxmlformats.org/markup-compatibility/2006" xmlns:mo="http://schemas.microsoft.com/office/mac/office/2008/main" xmlns:mv="urn:schemas-microsoft-com:mac:vml" xmlns:o="urn:schemas-microsoft-com:office:office" xmlns:r="http://schemas.openxmlformats.org/officeDocument/2006/relationships" xmlns:v="urn:schemas-microsoft-com:vml" xmlns:w10="urn:schemas-microsoft-com:office:word" xmlns:w14="http://schemas.microsoft.com/office/word/2010/wordml" xmlns:w="http://schemas.openxmlformats.org/wordprocessingml/2006/main" xmlns:wne="http://schemas.microsoft.com/office/word/2006/wordml" xmlns:wp14="http://schemas.microsoft.com/office/word/2010/wordprocessingDrawing" xmlns:wp="http://schemas.openxmlformats.org/drawingml/2006/wordprocessingDrawing" xmlns:wpc="http://schemas.microsoft.com/office/word/2010/wordprocessingCanvas" xmlns:wpg="http://schemas.microsoft.com/office/word/2010/wordprocessingGroup" xmlns:wpi="http://schemas.microsoft.com/office/word/2010/wordprocessingInk" xmlns:wps="http://schemas.microsoft.com/office/word/2010/wordprocessingShape" mc:Ignorable="w14 wp14">
-  <w:p>
-    <w:pPr>
-      <w:pStyle w:val="Header"/>
-      <w:jc w:val="right"/>
-    </w:pPr>
-    <w:r>
-      <w:drawing>
-        <wp:inline xmlns:a="http://schemas.openxmlformats.org/drawingml/2006/main" xmlns:pic="http://schemas.openxmlformats.org/drawingml/2006/picture">
-          <wp:extent cx="1645920" cy="622871"/>
-          <wp:docPr id="1" name="Picture 1"/>
-          <wp:cNvGraphicFramePr>
-            <a:graphicFrameLocks noChangeAspect="1"/>
-          </wp:cNvGraphicFramePr>
-          <a:graphic>
-            <a:graphicData uri="http://schemas.openxmlformats.org/drawingml/2006/picture">
-              <pic:pic>
-                <pic:nvPicPr>
-                  <pic:cNvPr id="0" name="adept_logo.jpg"/>
-                  <pic:cNvPicPr/>
-                </pic:nvPicPr>
-                <pic:blipFill>
-                  <a:blip r:embed="rId1"/>
-                  <a:stretch>
-                    <a:fillRect/>
-                  </a:stretch>
-                </pic:blipFill>
-                <pic:spPr>
-                  <a:xfrm>
-                    <a:off x="0" y="0"/>
-                    <a:ext cx="1645920" cy="622871"/>
-                  </a:xfrm>
-                  <a:prstGeom prst="rect"/>
-                </pic:spPr>
-              </pic:pic>
-            </a:graphicData>
-          </a:graphic>
-        </wp:inline>
-      </w:drawing>
-    </w:r>
-  </w:p>
-</w:hdr>
 </file>
 
 <file path=word/numbering.xml><?xml version="1.0" encoding="utf-8"?>

</xml_diff>